<commit_message>
feat: botón Documento único con detección automática de formato (cómputo/celular/SIM)
- Un solo botón 'Documento' que detecta el tipo de equipo y usa la plantilla correcta
- Computadora → FormatoComputo-.docx
- Celular/SIM → FormatoCelular-.docx
- Corrección de nombre de plantilla (FormatoCelular-.docx)
- Plantilla FormatoCelular-.docx añadida
- .gitignore para excluir db.sqlite3 y node_modules

Made-with: Cursor
</commit_message>
<xml_diff>
--- a/IT-INVENTORI_2/templates/documentos/FormatoComputo-.docx
+++ b/IT-INVENTORI_2/templates/documentos/FormatoComputo-.docx
@@ -1066,6 +1066,7 @@
           </w:tcPr>
           <w:p>
             <w:pPr>
+              <w:pStyle w:val="Normal"/>
               <w:spacing w:line="360" w:lineRule="auto"/>
               <w:jc w:val="both"/>
               <w:rPr>
@@ -1109,42 +1110,19 @@
             <w:r>
               <w:rPr>
                 <w:rFonts w:ascii="Roboto" w:hAnsi="Roboto" w:eastAsia="Roboto" w:cs="Roboto"/>
-                <w:color w:val="000000" w:themeColor="text1" w:themeTint="FF" w:themeShade="FF"/>
-                <w:sz w:val="18"/>
-                <w:szCs w:val="18"/>
-                <w:lang w:eastAsia="es-MX"/>
-              </w:rPr>
-              <w:t>Marzo</w:t>
-            </w:r>
-            <w:r>
-              <w:rPr>
-                <w:rFonts w:ascii="Roboto" w:hAnsi="Roboto" w:eastAsia="Roboto" w:cs="Roboto"/>
-                <w:color w:val="000000" w:themeColor="text1" w:themeTint="FF" w:themeShade="FF"/>
-                <w:sz w:val="18"/>
-                <w:szCs w:val="18"/>
-                <w:lang w:eastAsia="es-MX"/>
-              </w:rPr>
-              <w:t xml:space="preserve"> 4</w:t>
-            </w:r>
-            <w:r>
-              <w:rPr>
-                <w:rFonts w:ascii="Roboto" w:hAnsi="Roboto" w:eastAsia="Roboto" w:cs="Roboto"/>
-                <w:color w:val="000000" w:themeColor="text1" w:themeTint="FF" w:themeShade="FF"/>
-                <w:sz w:val="18"/>
-                <w:szCs w:val="18"/>
-                <w:lang w:eastAsia="es-MX"/>
-              </w:rPr>
-              <w:t>, 202</w:t>
-            </w:r>
-            <w:r>
-              <w:rPr>
-                <w:rFonts w:ascii="Roboto" w:hAnsi="Roboto" w:eastAsia="Roboto" w:cs="Roboto"/>
-                <w:color w:val="000000" w:themeColor="text1" w:themeTint="FF" w:themeShade="FF"/>
-                <w:sz w:val="18"/>
-                <w:szCs w:val="18"/>
-                <w:lang w:eastAsia="es-MX"/>
-              </w:rPr>
-              <w:t>6</w:t>
+                <w:b w:val="0"/>
+                <w:bCs w:val="0"/>
+                <w:i w:val="0"/>
+                <w:iCs w:val="0"/>
+                <w:caps w:val="0"/>
+                <w:smallCaps w:val="0"/>
+                <w:noProof w:val="0"/>
+                <w:color w:val="000000" w:themeColor="text1" w:themeTint="FF" w:themeShade="FF"/>
+                <w:sz w:val="18"/>
+                <w:szCs w:val="18"/>
+                <w:lang w:val="es-MX"/>
+              </w:rPr>
+              <w:t>{fecha_asignacion}</w:t>
             </w:r>
           </w:p>
         </w:tc>
@@ -1155,6 +1133,7 @@
           </w:tcPr>
           <w:p>
             <w:pPr>
+              <w:pStyle w:val="Normal"/>
               <w:spacing w:line="360" w:lineRule="auto"/>
               <w:jc w:val="both"/>
               <w:rPr>
@@ -1208,32 +1187,19 @@
             <w:r>
               <w:rPr>
                 <w:rFonts w:ascii="Roboto" w:hAnsi="Roboto" w:eastAsia="Roboto" w:cs="Roboto"/>
-                <w:color w:val="000000" w:themeColor="text1" w:themeTint="FF" w:themeShade="FF"/>
-                <w:sz w:val="18"/>
-                <w:szCs w:val="18"/>
-                <w:lang w:eastAsia="es-MX"/>
-              </w:rPr>
-              <w:t>Marzo 4</w:t>
-            </w:r>
-            <w:r>
-              <w:rPr>
-                <w:rFonts w:ascii="Roboto" w:hAnsi="Roboto" w:eastAsia="Roboto" w:cs="Roboto"/>
-                <w:color w:val="000000" w:themeColor="text1" w:themeTint="FF" w:themeShade="FF"/>
-                <w:sz w:val="18"/>
-                <w:szCs w:val="18"/>
-                <w:lang w:eastAsia="es-MX"/>
-              </w:rPr>
-              <w:t>, 202</w:t>
-            </w:r>
-            <w:r>
-              <w:rPr>
-                <w:rFonts w:ascii="Roboto" w:hAnsi="Roboto" w:eastAsia="Roboto" w:cs="Roboto"/>
-                <w:color w:val="000000" w:themeColor="text1" w:themeTint="FF" w:themeShade="FF"/>
-                <w:sz w:val="18"/>
-                <w:szCs w:val="18"/>
-                <w:lang w:eastAsia="es-MX"/>
-              </w:rPr>
-              <w:t>6</w:t>
+                <w:b w:val="0"/>
+                <w:bCs w:val="0"/>
+                <w:i w:val="0"/>
+                <w:iCs w:val="0"/>
+                <w:caps w:val="0"/>
+                <w:smallCaps w:val="0"/>
+                <w:noProof w:val="0"/>
+                <w:color w:val="000000" w:themeColor="text1" w:themeTint="FF" w:themeShade="FF"/>
+                <w:sz w:val="18"/>
+                <w:szCs w:val="18"/>
+                <w:lang w:val="es-MX"/>
+              </w:rPr>
+              <w:t>{fecha_asignacion}</w:t>
             </w:r>
           </w:p>
         </w:tc>

</xml_diff>